<commit_message>
Point the journal build at the journal manuscript
submission/bmb held a document built from REVISED_MANUSCRIPT_authordate.md, the
preprint text with author-date references. It carried the old title and none of
the journal manuscript's content, and would have been submitted as the paper if
nobody had checked which source it came from.

The build now takes BMB_MANUSCRIPT.md, and tolerates a manuscript with no
'Figure legends' section by not embedding images at all, which is the correct
journal format: captions in a section of their own and the figure files uploaded
separately.
</commit_message>
<xml_diff>
--- a/submission/biorxiv_v2/Piranfar_persistence_framework_bioRxiv_v2.docx
+++ b/submission/biorxiv_v2/Piranfar_persistence_framework_bioRxiv_v2.docx
@@ -3529,7 +3529,7 @@
       <w:r>
         <w:drawing>
           <wp:inline xmlns:a="http://schemas.openxmlformats.org/drawingml/2006/main" xmlns:pic="http://schemas.openxmlformats.org/drawingml/2006/picture">
-            <wp:extent cx="5852160" cy="5935206"/>
+            <wp:extent cx="5852160" cy="6602171"/>
             <wp:docPr id="6" name="Picture 6"/>
             <wp:cNvGraphicFramePr>
               <a:graphicFrameLocks noChangeAspect="1"/>
@@ -3550,7 +3550,7 @@
                   <pic:spPr>
                     <a:xfrm>
                       <a:off x="0" y="0"/>
-                      <a:ext cx="5852160" cy="5935206"/>
+                      <a:ext cx="5852160" cy="6602171"/>
                     </a:xfrm>
                     <a:prstGeom prst="rect"/>
                   </pic:spPr>

</xml_diff>